<commit_message>
Added more info to project scope and started EDA on dataset
</commit_message>
<xml_diff>
--- a/project-scope.docx
+++ b/project-scope.docx
@@ -32,13 +32,38 @@
         <w:t xml:space="preserve">Project Title </w:t>
       </w:r>
     </w:p>
-    <w:p/>
+    <w:p>
+      <w:pPr>
+        <w:rPr>
+          <w:sz w:val="32"/>
+          <w:szCs w:val="32"/>
+        </w:rPr>
+      </w:pPr>
+      <w:r>
+        <w:rPr>
+          <w:sz w:val="32"/>
+          <w:szCs w:val="32"/>
+        </w:rPr>
+        <w:t>Inventory Demand Forecasting</w:t>
+      </w:r>
+    </w:p>
     <w:p>
       <w:pPr>
         <w:pStyle w:val="Heading1"/>
       </w:pPr>
       <w:r>
         <w:t>Problem Description</w:t>
+      </w:r>
+    </w:p>
+    <w:p>
+      <w:r>
+        <w:t xml:space="preserve">An organisation wants to be able manage stock levels better to avoid over </w:t>
+      </w:r>
+      <w:r>
+        <w:t>stocking,</w:t>
+      </w:r>
+      <w:r>
+        <w:t xml:space="preserve"> which is costing too much, and understocking which renders them unable to meet demand.</w:t>
       </w:r>
     </w:p>
     <w:p/>
@@ -50,6 +75,14 @@
         <w:t>What is the business or policy problem being faced?</w:t>
       </w:r>
     </w:p>
+    <w:p>
+      <w:r>
+        <w:t xml:space="preserve">Not enough sales due to understocking, </w:t>
+      </w:r>
+      <w:r>
+        <w:t>high holding costs due to overstocking.</w:t>
+      </w:r>
+    </w:p>
     <w:p/>
     <w:p>
       <w:pPr>
@@ -59,7 +92,11 @@
         <w:t>Who or what is affected by this problem?</w:t>
       </w:r>
     </w:p>
-    <w:p/>
+    <w:p>
+      <w:r>
+        <w:t>The organisation</w:t>
+      </w:r>
+    </w:p>
     <w:p>
       <w:pPr>
         <w:pStyle w:val="Heading1"/>
@@ -95,9 +132,75 @@
       <w:tblGrid>
         <w:gridCol w:w="382"/>
         <w:gridCol w:w="2534"/>
-        <w:gridCol w:w="2534"/>
-        <w:gridCol w:w="2539"/>
+        <w:gridCol w:w="3033"/>
+        <w:gridCol w:w="2040"/>
       </w:tblGrid>
+      <w:tr>
+        <w:trPr>
+          <w:trHeight w:val="1201"/>
+          <w:jc w:val="center"/>
+        </w:trPr>
+        <w:tc>
+          <w:tcPr>
+            <w:tcW w:w="382" w:type="dxa"/>
+          </w:tcPr>
+          <w:p/>
+        </w:tc>
+        <w:tc>
+          <w:tcPr>
+            <w:tcW w:w="2534" w:type="dxa"/>
+            <w:vAlign w:val="center"/>
+          </w:tcPr>
+          <w:p>
+            <w:pPr>
+              <w:jc w:val="center"/>
+            </w:pPr>
+            <w:r>
+              <w:t>Goal</w:t>
+            </w:r>
+          </w:p>
+        </w:tc>
+        <w:tc>
+          <w:tcPr>
+            <w:tcW w:w="3033" w:type="dxa"/>
+            <w:vAlign w:val="center"/>
+          </w:tcPr>
+          <w:p>
+            <w:pPr>
+              <w:jc w:val="center"/>
+            </w:pPr>
+            <w:r>
+              <w:t>Goal Type</w:t>
+            </w:r>
+          </w:p>
+          <w:p>
+            <w:pPr>
+              <w:jc w:val="center"/>
+            </w:pPr>
+            <w:r>
+              <w:rPr>
+                <w:sz w:val="18"/>
+                <w:szCs w:val="18"/>
+              </w:rPr>
+              <w:t>(Efficiency, Effectiveness, or Equity)</w:t>
+            </w:r>
+          </w:p>
+        </w:tc>
+        <w:tc>
+          <w:tcPr>
+            <w:tcW w:w="2040" w:type="dxa"/>
+            <w:vAlign w:val="center"/>
+          </w:tcPr>
+          <w:p>
+            <w:pPr>
+              <w:jc w:val="center"/>
+            </w:pPr>
+            <w:r>
+              <w:t>Constraints around this goal</w:t>
+            </w:r>
+          </w:p>
+        </w:tc>
+      </w:tr>
       <w:tr>
         <w:trPr>
           <w:trHeight w:val="925"/>
@@ -106,50 +209,42 @@
         <w:tc>
           <w:tcPr>
             <w:tcW w:w="382" w:type="dxa"/>
-          </w:tcPr>
-          <w:p/>
+            <w:vAlign w:val="center"/>
+          </w:tcPr>
+          <w:p>
+            <w:pPr>
+              <w:jc w:val="center"/>
+            </w:pPr>
+            <w:r>
+              <w:t>1</w:t>
+            </w:r>
+          </w:p>
         </w:tc>
         <w:tc>
           <w:tcPr>
             <w:tcW w:w="2534" w:type="dxa"/>
-            <w:vAlign w:val="center"/>
-          </w:tcPr>
-          <w:p>
-            <w:pPr>
-              <w:jc w:val="center"/>
-            </w:pPr>
-            <w:r>
-              <w:t>Goal</w:t>
-            </w:r>
-          </w:p>
-        </w:tc>
-        <w:tc>
-          <w:tcPr>
-            <w:tcW w:w="2534" w:type="dxa"/>
-            <w:vAlign w:val="center"/>
-          </w:tcPr>
-          <w:p>
-            <w:pPr>
-              <w:jc w:val="center"/>
-            </w:pPr>
-            <w:r>
-              <w:t>Goal Type</w:t>
-            </w:r>
-          </w:p>
-        </w:tc>
-        <w:tc>
-          <w:tcPr>
-            <w:tcW w:w="2539" w:type="dxa"/>
-            <w:vAlign w:val="center"/>
-          </w:tcPr>
-          <w:p>
-            <w:pPr>
-              <w:jc w:val="center"/>
-            </w:pPr>
-            <w:r>
-              <w:t>Constraints around this goal</w:t>
-            </w:r>
-          </w:p>
+          </w:tcPr>
+          <w:p>
+            <w:r>
+              <w:t>Create a machine learning model that can efficiently predict demand.</w:t>
+            </w:r>
+          </w:p>
+        </w:tc>
+        <w:tc>
+          <w:tcPr>
+            <w:tcW w:w="3033" w:type="dxa"/>
+          </w:tcPr>
+          <w:p>
+            <w:r>
+              <w:t>Minimise overstocking and understocking.</w:t>
+            </w:r>
+          </w:p>
+        </w:tc>
+        <w:tc>
+          <w:tcPr>
+            <w:tcW w:w="2040" w:type="dxa"/>
+          </w:tcPr>
+          <w:p/>
         </w:tc>
       </w:tr>
       <w:tr>
@@ -167,7 +262,7 @@
               <w:jc w:val="center"/>
             </w:pPr>
             <w:r>
-              <w:t>1</w:t>
+              <w:t>2</w:t>
             </w:r>
           </w:p>
         </w:tc>
@@ -179,13 +274,13 @@
         </w:tc>
         <w:tc>
           <w:tcPr>
-            <w:tcW w:w="2534" w:type="dxa"/>
-          </w:tcPr>
-          <w:p/>
-        </w:tc>
-        <w:tc>
-          <w:tcPr>
-            <w:tcW w:w="2539" w:type="dxa"/>
+            <w:tcW w:w="3033" w:type="dxa"/>
+          </w:tcPr>
+          <w:p/>
+        </w:tc>
+        <w:tc>
+          <w:tcPr>
+            <w:tcW w:w="2040" w:type="dxa"/>
           </w:tcPr>
           <w:p/>
         </w:tc>
@@ -205,7 +300,8 @@
               <w:jc w:val="center"/>
             </w:pPr>
             <w:r>
-              <w:t>2</w:t>
+              <w:lastRenderedPageBreak/>
+              <w:t>3</w:t>
             </w:r>
           </w:p>
         </w:tc>
@@ -217,51 +313,13 @@
         </w:tc>
         <w:tc>
           <w:tcPr>
-            <w:tcW w:w="2534" w:type="dxa"/>
-          </w:tcPr>
-          <w:p/>
-        </w:tc>
-        <w:tc>
-          <w:tcPr>
-            <w:tcW w:w="2539" w:type="dxa"/>
-          </w:tcPr>
-          <w:p/>
-        </w:tc>
-      </w:tr>
-      <w:tr>
-        <w:trPr>
-          <w:trHeight w:val="925"/>
-          <w:jc w:val="center"/>
-        </w:trPr>
-        <w:tc>
-          <w:tcPr>
-            <w:tcW w:w="382" w:type="dxa"/>
-            <w:vAlign w:val="center"/>
-          </w:tcPr>
-          <w:p>
-            <w:pPr>
-              <w:jc w:val="center"/>
-            </w:pPr>
-            <w:r>
-              <w:t>3</w:t>
-            </w:r>
-          </w:p>
-        </w:tc>
-        <w:tc>
-          <w:tcPr>
-            <w:tcW w:w="2534" w:type="dxa"/>
-          </w:tcPr>
-          <w:p/>
-        </w:tc>
-        <w:tc>
-          <w:tcPr>
-            <w:tcW w:w="2534" w:type="dxa"/>
-          </w:tcPr>
-          <w:p/>
-        </w:tc>
-        <w:tc>
-          <w:tcPr>
-            <w:tcW w:w="2539" w:type="dxa"/>
+            <w:tcW w:w="3033" w:type="dxa"/>
+          </w:tcPr>
+          <w:p/>
+        </w:tc>
+        <w:tc>
+          <w:tcPr>
+            <w:tcW w:w="2040" w:type="dxa"/>
           </w:tcPr>
           <w:p/>
         </w:tc>
@@ -273,7 +331,6 @@
         <w:pStyle w:val="Heading1"/>
       </w:pPr>
       <w:r>
-        <w:lastRenderedPageBreak/>
         <w:t>Actions</w:t>
       </w:r>
     </w:p>
@@ -624,6 +681,7 @@
               <w:jc w:val="center"/>
             </w:pPr>
             <w:r>
+              <w:lastRenderedPageBreak/>
               <w:t>What are the ethical issues associated with this action?</w:t>
             </w:r>
           </w:p>
@@ -661,7 +719,6 @@
               <w:jc w:val="center"/>
             </w:pPr>
             <w:r>
-              <w:lastRenderedPageBreak/>
               <w:t>Can you provide any other use</w:t>
             </w:r>
             <w:r>
@@ -713,10 +770,10 @@
         <w:tblLook w:val="04A0" w:firstRow="1" w:lastRow="0" w:firstColumn="1" w:lastColumn="0" w:noHBand="0" w:noVBand="1"/>
       </w:tblPr>
       <w:tblGrid>
-        <w:gridCol w:w="2258"/>
-        <w:gridCol w:w="2258"/>
-        <w:gridCol w:w="2258"/>
-        <w:gridCol w:w="2258"/>
+        <w:gridCol w:w="2142"/>
+        <w:gridCol w:w="3408"/>
+        <w:gridCol w:w="1741"/>
+        <w:gridCol w:w="1741"/>
       </w:tblGrid>
       <w:tr>
         <w:trPr>
@@ -793,7 +850,11 @@
           <w:tcPr>
             <w:tcW w:w="2258" w:type="dxa"/>
           </w:tcPr>
-          <w:p/>
+          <w:p>
+            <w:r>
+              <w:t>External Data</w:t>
+            </w:r>
+          </w:p>
         </w:tc>
         <w:tc>
           <w:tcPr>
@@ -830,7 +891,16 @@
           <w:tcPr>
             <w:tcW w:w="2258" w:type="dxa"/>
           </w:tcPr>
-          <w:p/>
+          <w:p>
+            <w:r>
+              <w:t xml:space="preserve">Kaggle: </w:t>
+            </w:r>
+            <w:proofErr w:type="spellStart"/>
+            <w:r>
+              <w:t>inventory_demand_forecasting</w:t>
+            </w:r>
+            <w:proofErr w:type="spellEnd"/>
+          </w:p>
         </w:tc>
         <w:tc>
           <w:tcPr>
@@ -867,7 +937,11 @@
           <w:tcPr>
             <w:tcW w:w="2258" w:type="dxa"/>
           </w:tcPr>
-          <w:p/>
+          <w:p>
+            <w:r>
+              <w:t>7 columns surrounding product order features</w:t>
+            </w:r>
+          </w:p>
         </w:tc>
         <w:tc>
           <w:tcPr>
@@ -904,7 +978,11 @@
           <w:tcPr>
             <w:tcW w:w="2258" w:type="dxa"/>
           </w:tcPr>
-          <w:p/>
+          <w:p>
+            <w:r>
+              <w:t>Product level</w:t>
+            </w:r>
+          </w:p>
         </w:tc>
         <w:tc>
           <w:tcPr>
@@ -1007,11 +1085,8 @@
               <w:jc w:val="center"/>
             </w:pPr>
             <w:r>
-              <w:t xml:space="preserve">Does the data have reliable and unique identifiers that can </w:t>
-            </w:r>
-            <w:r>
               <w:lastRenderedPageBreak/>
-              <w:t>be linked to other data sources?</w:t>
+              <w:t>Does the data have reliable and unique identifiers that can be linked to other data sources?</w:t>
             </w:r>
           </w:p>
         </w:tc>
@@ -1410,6 +1485,7 @@
               <w:jc w:val="center"/>
             </w:pPr>
             <w:r>
+              <w:lastRenderedPageBreak/>
               <w:t>Which action will this analysis inform?</w:t>
             </w:r>
           </w:p>
@@ -1447,7 +1523,6 @@
               <w:jc w:val="center"/>
             </w:pPr>
             <w:r>
-              <w:lastRenderedPageBreak/>
               <w:t>How will you validate this analysis using existing data?</w:t>
             </w:r>
           </w:p>

</xml_diff>

<commit_message>
Performed EDA and created first draft of model
</commit_message>
<xml_diff>
--- a/project-scope.docx
+++ b/project-scope.docx
@@ -1019,7 +1019,11 @@
           <w:tcPr>
             <w:tcW w:w="2258" w:type="dxa"/>
           </w:tcPr>
-          <w:p/>
+          <w:p>
+            <w:r>
+              <w:t>2023/01/01</w:t>
+            </w:r>
+          </w:p>
         </w:tc>
         <w:tc>
           <w:tcPr>
@@ -1056,7 +1060,11 @@
           <w:tcPr>
             <w:tcW w:w="2258" w:type="dxa"/>
           </w:tcPr>
-          <w:p/>
+          <w:p>
+            <w:r>
+              <w:t>Maximum is 2024/12/30 and nothing after</w:t>
+            </w:r>
+          </w:p>
         </w:tc>
         <w:tc>
           <w:tcPr>
@@ -1094,7 +1102,11 @@
           <w:tcPr>
             <w:tcW w:w="2258" w:type="dxa"/>
           </w:tcPr>
-          <w:p/>
+          <w:p>
+            <w:r>
+              <w:t>No</w:t>
+            </w:r>
+          </w:p>
         </w:tc>
         <w:tc>
           <w:tcPr>
@@ -1139,7 +1151,11 @@
           <w:tcPr>
             <w:tcW w:w="2258" w:type="dxa"/>
           </w:tcPr>
-          <w:p/>
+          <w:p>
+            <w:r>
+              <w:t>N/A</w:t>
+            </w:r>
+          </w:p>
         </w:tc>
         <w:tc>
           <w:tcPr>
@@ -1176,7 +1192,11 @@
           <w:tcPr>
             <w:tcW w:w="2258" w:type="dxa"/>
           </w:tcPr>
-          <w:p/>
+          <w:p>
+            <w:r>
+              <w:t>CSV</w:t>
+            </w:r>
+          </w:p>
         </w:tc>
         <w:tc>
           <w:tcPr>
@@ -1229,7 +1249,11 @@
           <w:tcPr>
             <w:tcW w:w="2258" w:type="dxa"/>
           </w:tcPr>
-          <w:p/>
+          <w:p>
+            <w:r>
+              <w:t>N/A</w:t>
+            </w:r>
+          </w:p>
         </w:tc>
         <w:tc>
           <w:tcPr>
@@ -1290,7 +1314,11 @@
           <w:tcPr>
             <w:tcW w:w="2258" w:type="dxa"/>
           </w:tcPr>
-          <w:p/>
+          <w:p>
+            <w:r>
+              <w:t>N/A</w:t>
+            </w:r>
+          </w:p>
         </w:tc>
         <w:tc>
           <w:tcPr>
@@ -1419,7 +1447,11 @@
           <w:tcPr>
             <w:tcW w:w="2283" w:type="dxa"/>
           </w:tcPr>
-          <w:p/>
+          <w:p>
+            <w:r>
+              <w:t>Regression</w:t>
+            </w:r>
+          </w:p>
         </w:tc>
         <w:tc>
           <w:tcPr>
@@ -1456,7 +1488,11 @@
           <w:tcPr>
             <w:tcW w:w="2283" w:type="dxa"/>
           </w:tcPr>
-          <w:p/>
+          <w:p>
+            <w:r>
+              <w:t>To be able to predict demand</w:t>
+            </w:r>
+          </w:p>
         </w:tc>
         <w:tc>
           <w:tcPr>
@@ -1547,7 +1583,11 @@
           <w:tcPr>
             <w:tcW w:w="2283" w:type="dxa"/>
           </w:tcPr>
-          <w:p/>
+          <w:p>
+            <w:r>
+              <w:t>I will split the data between training data and testing data to validate the model.</w:t>
+            </w:r>
+          </w:p>
         </w:tc>
         <w:tc>
           <w:tcPr>

</xml_diff>